<commit_message>
fix(blog): code review findings on the template downloads
- Standard positions scoped to occupations regulated from 1 Aug 2021
- Template posts no longer contradict their own Word download
- Gender-neutral signature sentence, LearnSlice as last editor,
  clickable post URL in the footer, timeframe column no longer wraps

Co-Authored-By: Claude Opus 5.5 <noreply@anthropic.com>
</commit_message>
<xml_diff>
--- a/public/downloads/apprenticeship-plan-template.docx
+++ b/public/downloads/apprenticeship-plan-template.docx
@@ -4802,7 +4802,34 @@
         <w:sz w:val="16"/>
         <w:szCs w:val="16"/>
       </w:rPr>
-      <w:t xml:space="preserve">Free template by LearnSlice · learnslice.com/blog/apprenticeship-plan-template-free · Not legal advice · Page </w:t>
+      <w:t xml:space="preserve">Free template by LearnSlice · </w:t>
+    </w:r>
+    <w:hyperlink w:history="1" r:id="rIdnv4f59xnxc24gk5gexh_4">
+      <w:r>
+        <w:rPr>
+          <w:color w:val="6B7280"/>
+          <w:sz w:val="16"/>
+          <w:szCs w:val="16"/>
+          <w:u w:val="single"/>
+        </w:rPr>
+        <w:t xml:space="preserve">learnslice.com/blog/apprenticeship-plan-template-free</w:t>
+      </w:r>
+    </w:hyperlink>
+    <w:r>
+      <w:rPr>
+        <w:color w:val="6B7280"/>
+        <w:sz w:val="16"/>
+        <w:szCs w:val="16"/>
+      </w:rPr>
+      <w:t xml:space="preserve"> · Not legal advice</w:t>
+    </w:r>
+    <w:r>
+      <w:rPr>
+        <w:color w:val="6B7280"/>
+        <w:sz w:val="16"/>
+        <w:szCs w:val="16"/>
+      </w:rPr>
+      <w:t xml:space="preserve"> · Page </w:t>
     </w:r>
     <w:r>
       <w:rPr>

</xml_diff>